<commit_message>
timeline figure and data processing
</commit_message>
<xml_diff>
--- a/sensing_methods_chapter.docx
+++ b/sensing_methods_chapter.docx
@@ -1255,7 +1255,44 @@
         <w:pStyle w:val="BodyText"/>
       </w:pPr>
       <w:r>
-        <w:t xml:space="preserve">Thus, the full recording time from when infants first put on the leggings until they take them off before bedtime is longer than the amount of usable data when infants are awake and wearing the sensors. In our past work, we recorded XX sessions from XX infants in hopes of capturing the full waking day. Full recording time ranged from XX-XX (M = X) and usable data time ranged from XX-XX (M = X). Shorter usable sessions resulted from long excursions out of the house combined with long naps at home.</w:t>
+        <w:t xml:space="preserve">Thus, the full recording time from when infants first put on the leggings until they take them off before bedtime is longer than the amount of usable data when infants are awake and wearing the sensors. In our past work, we recorded 136 sessions from 67 infants in hopes of capturing the full waking day</w:t>
+      </w:r>
+      <w:r>
+        <w:t xml:space="preserve"> </w:t>
+      </w:r>
+      <w:r>
+        <w:t xml:space="preserve">(for a more detailed description of the dataset, see</w:t>
+      </w:r>
+      <w:r>
+        <w:t xml:space="preserve"> </w:t>
+      </w:r>
+      <w:hyperlink w:anchor="ref-RouseyTang2026">
+        <w:r>
+          <w:rPr>
+            <w:rStyle w:val="Hyperlink"/>
+          </w:rPr>
+          <w:t xml:space="preserve">Rousey et al., 2026</w:t>
+        </w:r>
+      </w:hyperlink>
+      <w:r>
+        <w:t xml:space="preserve">;</w:t>
+      </w:r>
+      <w:r>
+        <w:t xml:space="preserve"> </w:t>
+      </w:r>
+      <w:hyperlink w:anchor="ref-FranchakRousey2026">
+        <w:r>
+          <w:rPr>
+            <w:rStyle w:val="Hyperlink"/>
+          </w:rPr>
+          <w:t xml:space="preserve">Franchak, Rousey, et al., 2026</w:t>
+        </w:r>
+      </w:hyperlink>
+      <w:r>
+        <w:t xml:space="preserve">)</w:t>
+      </w:r>
+      <w:r>
+        <w:t xml:space="preserve">. Full recording time ranged from 2-12 hours (median = 9.8) and usable data time ranged from 2-10.5 hours (median = 5.8). Shorter usable recording time resulted from long excursions out of the house combined with long naps at home.</w:t>
       </w:r>
     </w:p>
     <w:p>
@@ -1268,7 +1305,7 @@
     </w:p>
     <w:bookmarkEnd w:id="35"/>
     <w:bookmarkEnd w:id="36"/>
-    <w:bookmarkStart w:id="39" w:name="data-processing-and-model-training"/>
+    <w:bookmarkStart w:id="40" w:name="data-processing-and-model-training"/>
     <w:p>
       <w:pPr>
         <w:pStyle w:val="Heading1"/>
@@ -1295,13 +1332,13 @@
       </w:r>
     </w:p>
     <w:bookmarkEnd w:id="37"/>
-    <w:bookmarkStart w:id="38" w:name="scoring-ground-truth"/>
+    <w:bookmarkStart w:id="38" w:name="model-training-and-testing"/>
     <w:p>
       <w:pPr>
         <w:pStyle w:val="Heading2"/>
       </w:pPr>
       <w:r>
-        <w:t xml:space="preserve">Scoring Ground Truth</w:t>
+        <w:t xml:space="preserve">Model Training and Testing</w:t>
       </w:r>
     </w:p>
     <w:p>
@@ -1309,18 +1346,68 @@
         <w:pStyle w:val="FirstParagraph"/>
       </w:pPr>
       <w:r>
-        <w:t xml:space="preserve">Synchronization Developing coding scheme is what determines output</w:t>
+        <w:t xml:space="preserve">Individual models vs. group models and generalization LOOCV examples Sensor CP model composition and size examples</w:t>
+      </w:r>
+    </w:p>
+    <w:p>
+      <w:pPr>
+        <w:pStyle w:val="BodyText"/>
+      </w:pPr>
+      <w:r>
+        <w:t xml:space="preserve">Point to general refs about binary and multi-class categorization Project needs dictate what is relevant for evaluation (overall metrics vs. bouts, absolute time vs. relative time, generalization to new exemplars vs. best prediction of current data)</w:t>
       </w:r>
     </w:p>
     <w:bookmarkEnd w:id="38"/>
+    <w:bookmarkStart w:id="39" w:name="X276a1c0c73d22fa31922f71f3e5e966252987ab"/>
+    <w:p>
+      <w:pPr>
+        <w:pStyle w:val="Heading2"/>
+      </w:pPr>
+      <w:r>
+        <w:t xml:space="preserve">Validation of Position and Restraint Models</w:t>
+      </w:r>
+    </w:p>
+    <w:p>
+      <w:pPr>
+        <w:pStyle w:val="FirstParagraph"/>
+      </w:pPr>
+      <w:r>
+        <w:t xml:space="preserve">Accuracy/kappa Kaya lab paper</w:t>
+      </w:r>
+    </w:p>
+    <w:p>
+      <w:pPr>
+        <w:pStyle w:val="BodyText"/>
+      </w:pPr>
+      <w:r>
+        <w:t xml:space="preserve">Continuous outcomes (Yao) for prevalence predictions</w:t>
+      </w:r>
+    </w:p>
+    <w:p>
+      <w:pPr>
+        <w:pStyle w:val="BodyText"/>
+      </w:pPr>
+      <w:r>
+        <w:t xml:space="preserve">Distal comparison</w:t>
+      </w:r>
+    </w:p>
+    <w:p>
+      <w:pPr>
+        <w:pStyle w:val="BodyText"/>
+      </w:pPr>
+      <w:r>
+        <w:t xml:space="preserve">Bout structure</w:t>
+      </w:r>
+    </w:p>
     <w:bookmarkEnd w:id="39"/>
-    <w:bookmarkStart w:id="42" w:name="model-evaluation"/>
+    <w:bookmarkEnd w:id="40"/>
+    <w:bookmarkStart w:id="41" w:name="applications"/>
     <w:p>
       <w:pPr>
         <w:pStyle w:val="Heading1"/>
       </w:pPr>
       <w:r>
-        <w:t xml:space="preserve">Model Evaluation</w:t>
+        <w:t xml:space="preserve">Applications</w:t>
       </w:r>
     </w:p>
     <w:p>
@@ -1328,42 +1415,7 @@
         <w:pStyle w:val="FirstParagraph"/>
       </w:pPr>
       <w:r>
-        <w:t xml:space="preserve">Point to general refs about binary and multi-class categorization Project needs dictate what is relevant for evaluation (overall metrics vs. bouts, absolute time vs. relative time, generalization to new exemplars vs. best prediction of current data)</w:t>
-      </w:r>
-    </w:p>
-    <w:bookmarkStart w:id="40" w:name="trainingtesting-partition"/>
-    <w:p>
-      <w:pPr>
-        <w:pStyle w:val="Heading2"/>
-      </w:pPr>
-      <w:r>
-        <w:t xml:space="preserve">Training/Testing Partition</w:t>
-      </w:r>
-    </w:p>
-    <w:p>
-      <w:pPr>
-        <w:pStyle w:val="FirstParagraph"/>
-      </w:pPr>
-      <w:r>
-        <w:t xml:space="preserve">Individual models vs. group models and generalization LOOCV examples Sensor CP model composition and size examples</w:t>
-      </w:r>
-    </w:p>
-    <w:bookmarkEnd w:id="40"/>
-    <w:bookmarkStart w:id="41" w:name="evaluation-metrics"/>
-    <w:p>
-      <w:pPr>
-        <w:pStyle w:val="Heading2"/>
-      </w:pPr>
-      <w:r>
-        <w:t xml:space="preserve">Evaluation Metrics</w:t>
-      </w:r>
-    </w:p>
-    <w:p>
-      <w:pPr>
-        <w:pStyle w:val="FirstParagraph"/>
-      </w:pPr>
-      <w:r>
-        <w:t xml:space="preserve">Accuracy/kappa Kaya lab paper</w:t>
+        <w:t xml:space="preserve">Mobile health and surveillance (Airaksinen)</w:t>
       </w:r>
     </w:p>
     <w:p>
@@ -1371,126 +1423,171 @@
         <w:pStyle w:val="BodyText"/>
       </w:pPr>
       <w:r>
-        <w:t xml:space="preserve">Continuous outcomes (Yao) for prevalence predictions Bout structure</w:t>
+        <w:t xml:space="preserve">Understanding atypical devel trajectories</w:t>
+      </w:r>
+    </w:p>
+    <w:p>
+      <w:pPr>
+        <w:pStyle w:val="BodyText"/>
+      </w:pPr>
+      <w:r>
+        <w:t xml:space="preserve">basic time series, dyadic interactions, etc.</w:t>
+      </w:r>
+    </w:p>
+    <w:p>
+      <w:pPr>
+        <w:pStyle w:val="BodyText"/>
+      </w:pPr>
+      <w:r>
+        <w:t xml:space="preserve">Integration with other sensor modalities</w:t>
+      </w:r>
+      <w:r>
+        <w:t xml:space="preserve"> </w:t>
+      </w:r>
+      <w:r>
+        <w:t xml:space="preserve">Rousey et al. (</w:t>
+      </w:r>
+      <w:hyperlink w:anchor="ref-RouseyTang2026">
+        <w:r>
+          <w:rPr>
+            <w:rStyle w:val="Hyperlink"/>
+          </w:rPr>
+          <w:t xml:space="preserve">2026</w:t>
+        </w:r>
+      </w:hyperlink>
+      <w:r>
+        <w:t xml:space="preserve">)</w:t>
+      </w:r>
+      <w:r>
+        <w:t xml:space="preserve"> </w:t>
+      </w:r>
+      <w:r>
+        <w:t xml:space="preserve">example.</w:t>
+      </w:r>
+      <w:r>
+        <w:t xml:space="preserve"> </w:t>
+      </w:r>
+      <w:r>
+        <w:t xml:space="preserve">Kaur et al. (</w:t>
+      </w:r>
+      <w:hyperlink w:anchor="ref-KaurKumar2026">
+        <w:r>
+          <w:rPr>
+            <w:rStyle w:val="Hyperlink"/>
+          </w:rPr>
+          <w:t xml:space="preserve">2026</w:t>
+        </w:r>
+      </w:hyperlink>
+      <w:r>
+        <w:t xml:space="preserve">)</w:t>
+      </w:r>
+      <w:r>
+        <w:t xml:space="preserve"> </w:t>
+      </w:r>
+      <w:r>
+        <w:t xml:space="preserve">review</w:t>
       </w:r>
     </w:p>
     <w:bookmarkEnd w:id="41"/>
+    <w:bookmarkStart w:id="77" w:name="references"/>
+    <w:p>
+      <w:pPr>
+        <w:pStyle w:val="Heading1"/>
+      </w:pPr>
+      <w:r>
+        <w:t xml:space="preserve">References</w:t>
+      </w:r>
+    </w:p>
+    <w:bookmarkStart w:id="68" w:name="refs"/>
+    <w:bookmarkStart w:id="42" w:name="ref-AiraksinenGallen2022"/>
+    <w:p>
+      <w:pPr>
+        <w:pStyle w:val="Bibliography"/>
+      </w:pPr>
+      <w:r>
+        <w:t xml:space="preserve">Airaksinen, M., Gallen, A., Kivi, A., Vijayakrishnan, P., Häyrinen, T., Ilén, E., Räsänen, O., Haataja, L. M., &amp; Vanhatalo, S. (2022). Intelligent wearable allows out-of-the-lab tracking of developing motor abilities in infants.</w:t>
+      </w:r>
+      <w:r>
+        <w:t xml:space="preserve"> </w:t>
+      </w:r>
+      <w:r>
+        <w:rPr>
+          <w:i/>
+          <w:iCs/>
+        </w:rPr>
+        <w:t xml:space="preserve">Communications Medicine</w:t>
+      </w:r>
+      <w:r>
+        <w:t xml:space="preserve">,</w:t>
+      </w:r>
+      <w:r>
+        <w:t xml:space="preserve"> </w:t>
+      </w:r>
+      <w:r>
+        <w:rPr>
+          <w:i/>
+          <w:iCs/>
+        </w:rPr>
+        <w:t xml:space="preserve">2</w:t>
+      </w:r>
+      <w:r>
+        <w:t xml:space="preserve">(1), 1–14.</w:t>
+      </w:r>
+    </w:p>
     <w:bookmarkEnd w:id="42"/>
-    <w:bookmarkStart w:id="43" w:name="applications"/>
-    <w:p>
-      <w:pPr>
-        <w:pStyle w:val="Heading1"/>
-      </w:pPr>
-      <w:r>
-        <w:t xml:space="preserve">Applications</w:t>
-      </w:r>
-    </w:p>
-    <w:p>
-      <w:pPr>
-        <w:pStyle w:val="FirstParagraph"/>
-      </w:pPr>
-      <w:r>
-        <w:t xml:space="preserve">Mobile health and surveillance (Airaksinen)</w:t>
-      </w:r>
-    </w:p>
-    <w:p>
-      <w:pPr>
-        <w:pStyle w:val="BodyText"/>
-      </w:pPr>
-      <w:r>
-        <w:t xml:space="preserve">Understanding atypical devel trajectories</w:t>
-      </w:r>
-    </w:p>
-    <w:p>
-      <w:pPr>
-        <w:pStyle w:val="BodyText"/>
-      </w:pPr>
-      <w:r>
-        <w:t xml:space="preserve">basic time series, dyadic interactions, etc.</w:t>
-      </w:r>
-    </w:p>
-    <w:p>
-      <w:pPr>
-        <w:pStyle w:val="BodyText"/>
-      </w:pPr>
-      <w:r>
-        <w:t xml:space="preserve">Integration with other sensor modalities</w:t>
-      </w:r>
-      <w:r>
-        <w:t xml:space="preserve"> </w:t>
-      </w:r>
-      <w:r>
-        <w:t xml:space="preserve">Rousey et al. (</w:t>
-      </w:r>
-      <w:hyperlink w:anchor="ref-RouseyTang2026">
-        <w:r>
-          <w:rPr>
-            <w:rStyle w:val="Hyperlink"/>
-          </w:rPr>
-          <w:t xml:space="preserve">2026</w:t>
-        </w:r>
-      </w:hyperlink>
-      <w:r>
-        <w:t xml:space="preserve">)</w:t>
-      </w:r>
-      <w:r>
-        <w:t xml:space="preserve"> </w:t>
-      </w:r>
-      <w:r>
-        <w:t xml:space="preserve">example.</w:t>
-      </w:r>
-      <w:r>
-        <w:t xml:space="preserve"> </w:t>
-      </w:r>
-      <w:r>
-        <w:t xml:space="preserve">Kaur et al. (</w:t>
-      </w:r>
-      <w:hyperlink w:anchor="ref-KaurKumar2026">
-        <w:r>
-          <w:rPr>
-            <w:rStyle w:val="Hyperlink"/>
-          </w:rPr>
-          <w:t xml:space="preserve">2026</w:t>
-        </w:r>
-      </w:hyperlink>
-      <w:r>
-        <w:t xml:space="preserve">)</w:t>
-      </w:r>
-      <w:r>
-        <w:t xml:space="preserve"> </w:t>
-      </w:r>
-      <w:r>
-        <w:t xml:space="preserve">review</w:t>
+    <w:bookmarkStart w:id="43" w:name="ref-AiraksinenRasanen2020"/>
+    <w:p>
+      <w:pPr>
+        <w:pStyle w:val="Bibliography"/>
+      </w:pPr>
+      <w:r>
+        <w:t xml:space="preserve">Airaksinen, M., Räsänen, O., Ilén, E., Häyrinen, T., Kivi, A., Marchi, V., Gallen, A., Blom, S., Varhe, A., Kaartinen, N., Haataja, L., &amp; Vanhatalo, S. (2020). Automatic posture and movement tracking of infants with wearable movement sensors.</w:t>
+      </w:r>
+      <w:r>
+        <w:t xml:space="preserve"> </w:t>
+      </w:r>
+      <w:r>
+        <w:rPr>
+          <w:i/>
+          <w:iCs/>
+        </w:rPr>
+        <w:t xml:space="preserve">Scientific Reports</w:t>
+      </w:r>
+      <w:r>
+        <w:t xml:space="preserve">,</w:t>
+      </w:r>
+      <w:r>
+        <w:t xml:space="preserve"> </w:t>
+      </w:r>
+      <w:r>
+        <w:rPr>
+          <w:i/>
+          <w:iCs/>
+        </w:rPr>
+        <w:t xml:space="preserve">10</w:t>
+      </w:r>
+      <w:r>
+        <w:t xml:space="preserve">(1), 169.</w:t>
       </w:r>
     </w:p>
     <w:bookmarkEnd w:id="43"/>
-    <w:bookmarkStart w:id="75" w:name="references"/>
-    <w:p>
-      <w:pPr>
-        <w:pStyle w:val="Heading1"/>
-      </w:pPr>
-      <w:r>
-        <w:t xml:space="preserve">References</w:t>
-      </w:r>
-    </w:p>
-    <w:bookmarkStart w:id="70" w:name="refs"/>
-    <w:bookmarkStart w:id="44" w:name="ref-AiraksinenGallen2022"/>
+    <w:bookmarkStart w:id="44" w:name="ref-AiraksinenRasanen2025"/>
     <w:p>
       <w:pPr>
         <w:pStyle w:val="Bibliography"/>
       </w:pPr>
       <w:r>
-        <w:t xml:space="preserve">Airaksinen, M., Gallen, A., Kivi, A., Vijayakrishnan, P., Häyrinen, T., Ilén, E., Räsänen, O., Haataja, L. M., &amp; Vanhatalo, S. (2022). Intelligent wearable allows out-of-the-lab tracking of developing motor abilities in infants.</w:t>
-      </w:r>
-      <w:r>
-        <w:t xml:space="preserve"> </w:t>
-      </w:r>
-      <w:r>
-        <w:rPr>
-          <w:i/>
-          <w:iCs/>
-        </w:rPr>
-        <w:t xml:space="preserve">Communications Medicine</w:t>
+        <w:t xml:space="preserve">Airaksinen, M., Räsänen, O., &amp; Vanhatalo, S. (2025). Trade-offs between simplifying inertial measurement unit-based movement recordings and the attainability of different levels of analyses: Systematic assessment of method variations.</w:t>
+      </w:r>
+      <w:r>
+        <w:t xml:space="preserve"> </w:t>
+      </w:r>
+      <w:r>
+        <w:rPr>
+          <w:i/>
+          <w:iCs/>
+        </w:rPr>
+        <w:t xml:space="preserve">JMIR mHealth and uHealth</w:t>
       </w:r>
       <w:r>
         <w:t xml:space="preserve">,</w:t>
@@ -1503,30 +1600,30 @@
           <w:i/>
           <w:iCs/>
         </w:rPr>
-        <w:t xml:space="preserve">2</w:t>
-      </w:r>
-      <w:r>
-        <w:t xml:space="preserve">(1), 1–14.</w:t>
+        <w:t xml:space="preserve">13</w:t>
+      </w:r>
+      <w:r>
+        <w:t xml:space="preserve">(1), e58078.</w:t>
       </w:r>
     </w:p>
     <w:bookmarkEnd w:id="44"/>
-    <w:bookmarkStart w:id="45" w:name="ref-AiraksinenRasanen2020"/>
+    <w:bookmarkStart w:id="45" w:name="ref-CallahanSisler1997"/>
     <w:p>
       <w:pPr>
         <w:pStyle w:val="Bibliography"/>
       </w:pPr>
       <w:r>
-        <w:t xml:space="preserve">Airaksinen, M., Räsänen, O., Ilén, E., Häyrinen, T., Kivi, A., Marchi, V., Gallen, A., Blom, S., Varhe, A., Kaartinen, N., Haataja, L., &amp; Vanhatalo, S. (2020). Automatic posture and movement tracking of infants with wearable movement sensors.</w:t>
-      </w:r>
-      <w:r>
-        <w:t xml:space="preserve"> </w:t>
-      </w:r>
-      <w:r>
-        <w:rPr>
-          <w:i/>
-          <w:iCs/>
-        </w:rPr>
-        <w:t xml:space="preserve">Scientific Reports</w:t>
+        <w:t xml:space="preserve">Callahan, C. W., &amp; Sisler, C. (1997). Use of seating devices in infants too young to sit.</w:t>
+      </w:r>
+      <w:r>
+        <w:t xml:space="preserve"> </w:t>
+      </w:r>
+      <w:r>
+        <w:rPr>
+          <w:i/>
+          <w:iCs/>
+        </w:rPr>
+        <w:t xml:space="preserve">Archives of Pediatrics &amp; Adolescent Medicine</w:t>
       </w:r>
       <w:r>
         <w:t xml:space="preserve">,</w:t>
@@ -1539,30 +1636,30 @@
           <w:i/>
           <w:iCs/>
         </w:rPr>
-        <w:t xml:space="preserve">10</w:t>
-      </w:r>
-      <w:r>
-        <w:t xml:space="preserve">(1), 169.</w:t>
+        <w:t xml:space="preserve">151</w:t>
+      </w:r>
+      <w:r>
+        <w:t xml:space="preserve">(3), 233–235.</w:t>
       </w:r>
     </w:p>
     <w:bookmarkEnd w:id="45"/>
-    <w:bookmarkStart w:id="46" w:name="ref-AiraksinenRasanen2025"/>
+    <w:bookmarkStart w:id="46" w:name="ref-Franchak2019aa"/>
     <w:p>
       <w:pPr>
         <w:pStyle w:val="Bibliography"/>
       </w:pPr>
       <w:r>
-        <w:t xml:space="preserve">Airaksinen, M., Räsänen, O., &amp; Vanhatalo, S. (2025). Trade-offs between simplifying inertial measurement unit-based movement recordings and the attainability of different levels of analyses: Systematic assessment of method variations.</w:t>
-      </w:r>
-      <w:r>
-        <w:t xml:space="preserve"> </w:t>
-      </w:r>
-      <w:r>
-        <w:rPr>
-          <w:i/>
-          <w:iCs/>
-        </w:rPr>
-        <w:t xml:space="preserve">JMIR mHealth and uHealth</w:t>
+        <w:t xml:space="preserve">Franchak, J. M. (2019). Changing opportunities for learning in everyday life: Infant body position over the first year.</w:t>
+      </w:r>
+      <w:r>
+        <w:t xml:space="preserve"> </w:t>
+      </w:r>
+      <w:r>
+        <w:rPr>
+          <w:i/>
+          <w:iCs/>
+        </w:rPr>
+        <w:t xml:space="preserve">Infancy</w:t>
       </w:r>
       <w:r>
         <w:t xml:space="preserve">,</w:t>
@@ -1575,30 +1672,30 @@
           <w:i/>
           <w:iCs/>
         </w:rPr>
-        <w:t xml:space="preserve">13</w:t>
-      </w:r>
-      <w:r>
-        <w:t xml:space="preserve">(1), e58078.</w:t>
+        <w:t xml:space="preserve">24</w:t>
+      </w:r>
+      <w:r>
+        <w:t xml:space="preserve">(2), 187–209.</w:t>
       </w:r>
     </w:p>
     <w:bookmarkEnd w:id="46"/>
-    <w:bookmarkStart w:id="47" w:name="ref-CallahanSisler1997"/>
+    <w:bookmarkStart w:id="47" w:name="ref-FranchakFord2026"/>
     <w:p>
       <w:pPr>
         <w:pStyle w:val="Bibliography"/>
       </w:pPr>
       <w:r>
-        <w:t xml:space="preserve">Callahan, C. W., &amp; Sisler, C. (1997). Use of seating devices in infants too young to sit.</w:t>
-      </w:r>
-      <w:r>
-        <w:t xml:space="preserve"> </w:t>
-      </w:r>
-      <w:r>
-        <w:rPr>
-          <w:i/>
-          <w:iCs/>
-        </w:rPr>
-        <w:t xml:space="preserve">Archives of Pediatrics &amp; Adolescent Medicine</w:t>
+        <w:t xml:space="preserve">Franchak, J. M., Ford, J., Fausey, C. M., &amp; Luna, A. (2026). Infants’ daily routines shape opportunities for perceptual-motor exploration.</w:t>
+      </w:r>
+      <w:r>
+        <w:t xml:space="preserve"> </w:t>
+      </w:r>
+      <w:r>
+        <w:rPr>
+          <w:i/>
+          <w:iCs/>
+        </w:rPr>
+        <w:t xml:space="preserve">Developmental Science</w:t>
       </w:r>
       <w:r>
         <w:t xml:space="preserve">,</w:t>
@@ -1611,20 +1708,405 @@
           <w:i/>
           <w:iCs/>
         </w:rPr>
-        <w:t xml:space="preserve">151</w:t>
-      </w:r>
-      <w:r>
-        <w:t xml:space="preserve">(3), 233–235.</w:t>
+        <w:t xml:space="preserve">29</w:t>
+      </w:r>
+      <w:r>
+        <w:t xml:space="preserve">(2), e70119.</w:t>
       </w:r>
     </w:p>
     <w:bookmarkEnd w:id="47"/>
-    <w:bookmarkStart w:id="48" w:name="ref-Franchak2019aa"/>
+    <w:bookmarkStart w:id="48" w:name="ref-FranchakKadooka2024"/>
     <w:p>
       <w:pPr>
         <w:pStyle w:val="Bibliography"/>
       </w:pPr>
       <w:r>
-        <w:t xml:space="preserve">Franchak, J. M. (2019). Changing opportunities for learning in everyday life: Infant body position over the first year.</w:t>
+        <w:t xml:space="preserve">Franchak, J. M., Kadooka, K., &amp; Fausey, C. M. (2024). Longitudinal relations between independent walking, body position, and object experiences in home life.</w:t>
+      </w:r>
+      <w:r>
+        <w:t xml:space="preserve"> </w:t>
+      </w:r>
+      <w:r>
+        <w:rPr>
+          <w:i/>
+          <w:iCs/>
+        </w:rPr>
+        <w:t xml:space="preserve">Developmental Psychology</w:t>
+      </w:r>
+      <w:r>
+        <w:t xml:space="preserve">,</w:t>
+      </w:r>
+      <w:r>
+        <w:t xml:space="preserve"> </w:t>
+      </w:r>
+      <w:r>
+        <w:rPr>
+          <w:i/>
+          <w:iCs/>
+        </w:rPr>
+        <w:t xml:space="preserve">60</w:t>
+      </w:r>
+      <w:r>
+        <w:t xml:space="preserve">(2), 228–242.</w:t>
+      </w:r>
+    </w:p>
+    <w:bookmarkEnd w:id="48"/>
+    <w:bookmarkStart w:id="49" w:name="ref-FranchakRousey2026"/>
+    <w:p>
+      <w:pPr>
+        <w:pStyle w:val="Bibliography"/>
+      </w:pPr>
+      <w:r>
+        <w:t xml:space="preserve">Franchak, J. M., Rousey, H. N., &amp; Wang, H. (2026). Natural statistics of infants’ everyday motor experiences relate to sitting and walking development.</w:t>
+      </w:r>
+      <w:r>
+        <w:t xml:space="preserve"> </w:t>
+      </w:r>
+      <w:r>
+        <w:rPr>
+          <w:i/>
+          <w:iCs/>
+        </w:rPr>
+        <w:t xml:space="preserve">Developmental Psychology</w:t>
+      </w:r>
+      <w:r>
+        <w:t xml:space="preserve">.</w:t>
+      </w:r>
+    </w:p>
+    <w:bookmarkEnd w:id="49"/>
+    <w:bookmarkStart w:id="50" w:name="ref-FranchakScott2021"/>
+    <w:p>
+      <w:pPr>
+        <w:pStyle w:val="Bibliography"/>
+      </w:pPr>
+      <w:r>
+        <w:t xml:space="preserve">Franchak, J. M., Scott, V., &amp; Luo, C. (2021). A contactless method for measuring full-day, naturalistic motor behavior using wearable inertial sensors.</w:t>
+      </w:r>
+      <w:r>
+        <w:t xml:space="preserve"> </w:t>
+      </w:r>
+      <w:r>
+        <w:rPr>
+          <w:i/>
+          <w:iCs/>
+        </w:rPr>
+        <w:t xml:space="preserve">Frontiers in Psychology</w:t>
+      </w:r>
+      <w:r>
+        <w:t xml:space="preserve">,</w:t>
+      </w:r>
+      <w:r>
+        <w:t xml:space="preserve"> </w:t>
+      </w:r>
+      <w:r>
+        <w:rPr>
+          <w:i/>
+          <w:iCs/>
+        </w:rPr>
+        <w:t xml:space="preserve">12</w:t>
+      </w:r>
+      <w:r>
+        <w:t xml:space="preserve">, 701343.</w:t>
+      </w:r>
+    </w:p>
+    <w:bookmarkEnd w:id="50"/>
+    <w:bookmarkStart w:id="51" w:name="ref-FranchakTang2024"/>
+    <w:p>
+      <w:pPr>
+        <w:pStyle w:val="Bibliography"/>
+      </w:pPr>
+      <w:r>
+        <w:t xml:space="preserve">Franchak, J. M., Tang, M., Rousey, H., &amp; Luo, C. (2024). Long-form recording of infant body position in the home using wearable inertial sensors.</w:t>
+      </w:r>
+      <w:r>
+        <w:t xml:space="preserve"> </w:t>
+      </w:r>
+      <w:r>
+        <w:rPr>
+          <w:i/>
+          <w:iCs/>
+        </w:rPr>
+        <w:t xml:space="preserve">Behavior Research Methods</w:t>
+      </w:r>
+      <w:r>
+        <w:t xml:space="preserve">,</w:t>
+      </w:r>
+      <w:r>
+        <w:t xml:space="preserve"> </w:t>
+      </w:r>
+      <w:r>
+        <w:rPr>
+          <w:i/>
+          <w:iCs/>
+        </w:rPr>
+        <w:t xml:space="preserve">56</w:t>
+      </w:r>
+      <w:r>
+        <w:t xml:space="preserve">(5), 4982–5001.</w:t>
+      </w:r>
+    </w:p>
+    <w:bookmarkEnd w:id="51"/>
+    <w:bookmarkStart w:id="52" w:name="ref-GreenspanCunha2021"/>
+    <w:p>
+      <w:pPr>
+        <w:pStyle w:val="Bibliography"/>
+      </w:pPr>
+      <w:r>
+        <w:t xml:space="preserve">Greenspan, B., Cunha, A. B., &amp; Lobo, M. A. (2021). Design and validation of a smart garment to measure positioning practices of parents with young infants.</w:t>
+      </w:r>
+      <w:r>
+        <w:t xml:space="preserve"> </w:t>
+      </w:r>
+      <w:r>
+        <w:rPr>
+          <w:i/>
+          <w:iCs/>
+        </w:rPr>
+        <w:t xml:space="preserve">Infant Behavior &amp; Development</w:t>
+      </w:r>
+      <w:r>
+        <w:t xml:space="preserve">,</w:t>
+      </w:r>
+      <w:r>
+        <w:t xml:space="preserve"> </w:t>
+      </w:r>
+      <w:r>
+        <w:rPr>
+          <w:i/>
+          <w:iCs/>
+        </w:rPr>
+        <w:t xml:space="preserve">62</w:t>
+      </w:r>
+      <w:r>
+        <w:t xml:space="preserve">, 101530.</w:t>
+      </w:r>
+    </w:p>
+    <w:bookmarkEnd w:id="52"/>
+    <w:bookmarkStart w:id="53" w:name="ref-HerzbergFletcher2021"/>
+    <w:p>
+      <w:pPr>
+        <w:pStyle w:val="Bibliography"/>
+      </w:pPr>
+      <w:r>
+        <w:t xml:space="preserve">Herzberg, O., Fletcher, K. K., Schatz, J. L., Adolph, K. E., &amp; Tamis-LeMonda, C. S. (2021). Infant exuberant object play at home: Immense amounts of time-distributed, variable practice.</w:t>
+      </w:r>
+      <w:r>
+        <w:t xml:space="preserve"> </w:t>
+      </w:r>
+      <w:r>
+        <w:rPr>
+          <w:i/>
+          <w:iCs/>
+        </w:rPr>
+        <w:t xml:space="preserve">Child Development</w:t>
+      </w:r>
+      <w:r>
+        <w:t xml:space="preserve">.</w:t>
+      </w:r>
+    </w:p>
+    <w:bookmarkEnd w:id="53"/>
+    <w:bookmarkStart w:id="54" w:name="ref-KarasikKuchirko2022"/>
+    <w:p>
+      <w:pPr>
+        <w:pStyle w:val="Bibliography"/>
+      </w:pPr>
+      <w:r>
+        <w:t xml:space="preserve">Karasik, L. B., Kuchirko, Y. A., Dodojonova, R., &amp; Elison, J. T. (2022). Comparison of</w:t>
+      </w:r>
+      <w:r>
+        <w:t xml:space="preserve"> </w:t>
+      </w:r>
+      <w:r>
+        <w:t xml:space="preserve">U</w:t>
+      </w:r>
+      <w:r>
+        <w:t xml:space="preserve">.</w:t>
+      </w:r>
+      <w:r>
+        <w:t xml:space="preserve">S</w:t>
+      </w:r>
+      <w:r>
+        <w:t xml:space="preserve">. And tajik infants’ time in containment devices.</w:t>
+      </w:r>
+      <w:r>
+        <w:t xml:space="preserve"> </w:t>
+      </w:r>
+      <w:r>
+        <w:rPr>
+          <w:i/>
+          <w:iCs/>
+        </w:rPr>
+        <w:t xml:space="preserve">Infant and Child Development</w:t>
+      </w:r>
+      <w:r>
+        <w:t xml:space="preserve">,</w:t>
+      </w:r>
+      <w:r>
+        <w:t xml:space="preserve"> </w:t>
+      </w:r>
+      <w:r>
+        <w:rPr>
+          <w:i/>
+          <w:iCs/>
+        </w:rPr>
+        <w:t xml:space="preserve">31</w:t>
+      </w:r>
+      <w:r>
+        <w:t xml:space="preserve">(4).</w:t>
+      </w:r>
+    </w:p>
+    <w:bookmarkEnd w:id="54"/>
+    <w:bookmarkStart w:id="55" w:name="ref-KaurKumar2026"/>
+    <w:p>
+      <w:pPr>
+        <w:pStyle w:val="Bibliography"/>
+      </w:pPr>
+      <w:r>
+        <w:t xml:space="preserve">Kaur, I., Kumar, Y., &amp; Modi, N. (2026). Machine learning and mobile sensing for naturalistic infant behavior (0-36 months): A comprehensive review and research agenda.</w:t>
+      </w:r>
+      <w:r>
+        <w:t xml:space="preserve"> </w:t>
+      </w:r>
+      <w:r>
+        <w:rPr>
+          <w:i/>
+          <w:iCs/>
+        </w:rPr>
+        <w:t xml:space="preserve">Infant Behavior &amp; Development</w:t>
+      </w:r>
+      <w:r>
+        <w:t xml:space="preserve">,</w:t>
+      </w:r>
+      <w:r>
+        <w:t xml:space="preserve"> </w:t>
+      </w:r>
+      <w:r>
+        <w:rPr>
+          <w:i/>
+          <w:iCs/>
+        </w:rPr>
+        <w:t xml:space="preserve">84</w:t>
+      </w:r>
+      <w:r>
+        <w:t xml:space="preserve">(102217), 102217.</w:t>
+      </w:r>
+    </w:p>
+    <w:bookmarkEnd w:id="55"/>
+    <w:bookmarkStart w:id="56" w:name="ref-KretchAdolph2015"/>
+    <w:p>
+      <w:pPr>
+        <w:pStyle w:val="Bibliography"/>
+      </w:pPr>
+      <w:r>
+        <w:t xml:space="preserve">Kretch, K. S., &amp; Adolph, K. E. (2015). Active vision in passive locomotion: Real-world free viewing in infants and adults.</w:t>
+      </w:r>
+      <w:r>
+        <w:t xml:space="preserve"> </w:t>
+      </w:r>
+      <w:r>
+        <w:rPr>
+          <w:i/>
+          <w:iCs/>
+        </w:rPr>
+        <w:t xml:space="preserve">Developmental Science</w:t>
+      </w:r>
+      <w:r>
+        <w:t xml:space="preserve">,</w:t>
+      </w:r>
+      <w:r>
+        <w:t xml:space="preserve"> </w:t>
+      </w:r>
+      <w:r>
+        <w:rPr>
+          <w:i/>
+          <w:iCs/>
+        </w:rPr>
+        <w:t xml:space="preserve">18</w:t>
+      </w:r>
+      <w:r>
+        <w:t xml:space="preserve">(5), 736–750.</w:t>
+      </w:r>
+    </w:p>
+    <w:bookmarkEnd w:id="56"/>
+    <w:bookmarkStart w:id="57" w:name="ref-KretchEnriques2026"/>
+    <w:p>
+      <w:pPr>
+        <w:pStyle w:val="Bibliography"/>
+      </w:pPr>
+      <w:r>
+        <w:t xml:space="preserve">Kretch, K. S., Enriques, F. A., Franchak, J. M., Abney, D. H., Bell, C. A., Jerry, C. M., Lindig, K., &amp; Steffen, G. (2026). Body position classification using wearable sensors in infants with cerebral palsy.</w:t>
+      </w:r>
+      <w:r>
+        <w:t xml:space="preserve"> </w:t>
+      </w:r>
+      <w:r>
+        <w:rPr>
+          <w:i/>
+          <w:iCs/>
+        </w:rPr>
+        <w:t xml:space="preserve">Infant Behavior &amp; Development</w:t>
+      </w:r>
+      <w:r>
+        <w:t xml:space="preserve">,</w:t>
+      </w:r>
+      <w:r>
+        <w:t xml:space="preserve"> </w:t>
+      </w:r>
+      <w:r>
+        <w:rPr>
+          <w:i/>
+          <w:iCs/>
+        </w:rPr>
+        <w:t xml:space="preserve">84</w:t>
+      </w:r>
+      <w:r>
+        <w:t xml:space="preserve">(102215), 102215.</w:t>
+      </w:r>
+    </w:p>
+    <w:bookmarkEnd w:id="57"/>
+    <w:bookmarkStart w:id="58" w:name="ref-KretchFranchak2014"/>
+    <w:p>
+      <w:pPr>
+        <w:pStyle w:val="Bibliography"/>
+      </w:pPr>
+      <w:r>
+        <w:t xml:space="preserve">Kretch, K. S., Franchak, J. M., &amp; Adolph, K. E. (2014). Crawling and walking infants see the world differently.</w:t>
+      </w:r>
+      <w:r>
+        <w:t xml:space="preserve"> </w:t>
+      </w:r>
+      <w:r>
+        <w:rPr>
+          <w:i/>
+          <w:iCs/>
+        </w:rPr>
+        <w:t xml:space="preserve">Child Development</w:t>
+      </w:r>
+      <w:r>
+        <w:t xml:space="preserve">,</w:t>
+      </w:r>
+      <w:r>
+        <w:t xml:space="preserve"> </w:t>
+      </w:r>
+      <w:r>
+        <w:rPr>
+          <w:i/>
+          <w:iCs/>
+        </w:rPr>
+        <w:t xml:space="preserve">85</w:t>
+      </w:r>
+      <w:r>
+        <w:t xml:space="preserve">(4), 1503–1518.</w:t>
+      </w:r>
+    </w:p>
+    <w:bookmarkEnd w:id="58"/>
+    <w:bookmarkStart w:id="59" w:name="ref-KretchLuna2025"/>
+    <w:p>
+      <w:pPr>
+        <w:pStyle w:val="Bibliography"/>
+      </w:pPr>
+      <w:r>
+        <w:t xml:space="preserve">Kretch, K. S., Luna, A., Fausey, C. M., &amp; Franchak, J. M. (2025). Infant sitting status, sitting age, and everyday positioning experience across the transition to independent sitting.</w:t>
       </w:r>
       <w:r>
         <w:t xml:space="preserve"> </w:t>
@@ -1647,20 +2129,20 @@
           <w:i/>
           <w:iCs/>
         </w:rPr>
-        <w:t xml:space="preserve">24</w:t>
-      </w:r>
-      <w:r>
-        <w:t xml:space="preserve">(2), 187–209.</w:t>
-      </w:r>
-    </w:p>
-    <w:bookmarkEnd w:id="48"/>
-    <w:bookmarkStart w:id="49" w:name="ref-FranchakFord2026"/>
+        <w:t xml:space="preserve">30</w:t>
+      </w:r>
+      <w:r>
+        <w:t xml:space="preserve">, e70059.</w:t>
+      </w:r>
+    </w:p>
+    <w:bookmarkEnd w:id="59"/>
+    <w:bookmarkStart w:id="60" w:name="ref-KretchMarcinowski2022"/>
     <w:p>
       <w:pPr>
         <w:pStyle w:val="Bibliography"/>
       </w:pPr>
       <w:r>
-        <w:t xml:space="preserve">Franchak, J. M., Ford, J., Fausey, C. M., &amp; Luna, A. (2026). Infants’ daily routines shape opportunities for perceptual-motor exploration.</w:t>
+        <w:t xml:space="preserve">Kretch, K. S., Marcinowski, E. C., Hsu, L.-Y., Koziol, N. A., Harbourne, R. T., Lobo, M. A., &amp; Dusing, S. C. (2022). Opportunities for learning and social interaction in infant sitting: Effects of sitting support, sitting skill, and gross motor delay.</w:t>
       </w:r>
       <w:r>
         <w:t xml:space="preserve"> </w:t>
@@ -1673,6 +2155,29 @@
         <w:t xml:space="preserve">Developmental Science</w:t>
       </w:r>
       <w:r>
+        <w:t xml:space="preserve">, e13318.</w:t>
+      </w:r>
+    </w:p>
+    <w:bookmarkEnd w:id="60"/>
+    <w:bookmarkStart w:id="61" w:name="ref-LuoFranchak2020"/>
+    <w:p>
+      <w:pPr>
+        <w:pStyle w:val="Bibliography"/>
+      </w:pPr>
+      <w:r>
+        <w:t xml:space="preserve">Luo, C., &amp; Franchak, J. M. (2020). Head and body structure infants’ visual experiences during mobile, naturalistic play.</w:t>
+      </w:r>
+      <w:r>
+        <w:t xml:space="preserve"> </w:t>
+      </w:r>
+      <w:r>
+        <w:rPr>
+          <w:i/>
+          <w:iCs/>
+        </w:rPr>
+        <w:t xml:space="preserve">PloS One</w:t>
+      </w:r>
+      <w:r>
         <w:t xml:space="preserve">,</w:t>
       </w:r>
       <w:r>
@@ -1683,30 +2188,125 @@
           <w:i/>
           <w:iCs/>
         </w:rPr>
+        <w:t xml:space="preserve">15</w:t>
+      </w:r>
+      <w:r>
+        <w:t xml:space="preserve">(11), e0242009.</w:t>
+      </w:r>
+    </w:p>
+    <w:bookmarkEnd w:id="61"/>
+    <w:bookmarkStart w:id="62" w:name="ref-MalachowskiSalo2023"/>
+    <w:p>
+      <w:pPr>
+        <w:pStyle w:val="Bibliography"/>
+      </w:pPr>
+      <w:r>
+        <w:t xml:space="preserve">Malachowski, L. G., Salo, V. C., Needham, A. W., &amp; Humphreys, K. L. (2023). Infant placement and language exposure in daily life.</w:t>
+      </w:r>
+      <w:r>
+        <w:t xml:space="preserve"> </w:t>
+      </w:r>
+      <w:r>
+        <w:rPr>
+          <w:i/>
+          <w:iCs/>
+        </w:rPr>
+        <w:t xml:space="preserve">Infant and Child Development</w:t>
+      </w:r>
+      <w:r>
+        <w:t xml:space="preserve">.</w:t>
+      </w:r>
+    </w:p>
+    <w:bookmarkEnd w:id="62"/>
+    <w:bookmarkStart w:id="63" w:name="ref-McElwainFisher2024"/>
+    <w:p>
+      <w:pPr>
+        <w:pStyle w:val="Bibliography"/>
+      </w:pPr>
+      <w:r>
+        <w:t xml:space="preserve">McElwain, N. L., Fisher, M. C., Nebeker, C., Bodway, J. M., Islam, B., &amp; Hasegawa-Johnson, M. (2024). Evaluating users’ experiences of a child multimodal wearable device: Mixed methods approach.</w:t>
+      </w:r>
+      <w:r>
+        <w:t xml:space="preserve"> </w:t>
+      </w:r>
+      <w:r>
+        <w:rPr>
+          <w:i/>
+          <w:iCs/>
+        </w:rPr>
+        <w:t xml:space="preserve">JMIR Human Factors</w:t>
+      </w:r>
+      <w:r>
+        <w:t xml:space="preserve">,</w:t>
+      </w:r>
+      <w:r>
+        <w:t xml:space="preserve"> </w:t>
+      </w:r>
+      <w:r>
+        <w:rPr>
+          <w:i/>
+          <w:iCs/>
+        </w:rPr>
+        <w:t xml:space="preserve">11</w:t>
+      </w:r>
+      <w:r>
+        <w:t xml:space="preserve">(1), e49316.</w:t>
+      </w:r>
+    </w:p>
+    <w:bookmarkEnd w:id="63"/>
+    <w:bookmarkStart w:id="64" w:name="ref-RouseyTang2026"/>
+    <w:p>
+      <w:pPr>
+        <w:pStyle w:val="Bibliography"/>
+      </w:pPr>
+      <w:r>
+        <w:t xml:space="preserve">Rousey, H. N., Tang, M., Garcia, S., &amp; Franchak, J. M. (2026). Within-day variations in infant body position predict caregiver speech input.</w:t>
+      </w:r>
+      <w:r>
+        <w:t xml:space="preserve"> </w:t>
+      </w:r>
+      <w:r>
+        <w:rPr>
+          <w:i/>
+          <w:iCs/>
+        </w:rPr>
+        <w:t xml:space="preserve">Developmental Science</w:t>
+      </w:r>
+      <w:r>
+        <w:t xml:space="preserve">,</w:t>
+      </w:r>
+      <w:r>
+        <w:t xml:space="preserve"> </w:t>
+      </w:r>
+      <w:r>
+        <w:rPr>
+          <w:i/>
+          <w:iCs/>
+        </w:rPr>
         <w:t xml:space="preserve">29</w:t>
       </w:r>
       <w:r>
-        <w:t xml:space="preserve">(2), e70119.</w:t>
-      </w:r>
-    </w:p>
-    <w:bookmarkEnd w:id="49"/>
-    <w:bookmarkStart w:id="50" w:name="ref-FranchakKadooka2024"/>
+        <w:t xml:space="preserve">(2), e70120.</w:t>
+      </w:r>
+    </w:p>
+    <w:bookmarkEnd w:id="64"/>
+    <w:bookmarkStart w:id="65" w:name="ref-SoskaAdolph2014"/>
     <w:p>
       <w:pPr>
         <w:pStyle w:val="Bibliography"/>
       </w:pPr>
       <w:r>
-        <w:t xml:space="preserve">Franchak, J. M., Kadooka, K., &amp; Fausey, C. M. (2024). Longitudinal relations between independent walking, body position, and object experiences in home life.</w:t>
-      </w:r>
-      <w:r>
-        <w:t xml:space="preserve"> </w:t>
-      </w:r>
-      <w:r>
-        <w:rPr>
-          <w:i/>
-          <w:iCs/>
-        </w:rPr>
-        <w:t xml:space="preserve">Developmental Psychology</w:t>
+        <w:t xml:space="preserve">Soska, K. C., &amp; Adolph, K. E. (2014). Postural position constrains multimodal object exploration in infants.</w:t>
+      </w:r>
+      <w:r>
+        <w:t xml:space="preserve"> </w:t>
+      </w:r>
+      <w:r>
+        <w:rPr>
+          <w:i/>
+          <w:iCs/>
+        </w:rPr>
+        <w:t xml:space="preserve">Infancy</w:t>
       </w:r>
       <w:r>
         <w:t xml:space="preserve">,</w:t>
@@ -1719,53 +2319,53 @@
           <w:i/>
           <w:iCs/>
         </w:rPr>
-        <w:t xml:space="preserve">60</w:t>
-      </w:r>
-      <w:r>
-        <w:t xml:space="preserve">(2), 228–242.</w:t>
-      </w:r>
-    </w:p>
-    <w:bookmarkEnd w:id="50"/>
-    <w:bookmarkStart w:id="51" w:name="ref-FranchakRousey2026"/>
+        <w:t xml:space="preserve">19</w:t>
+      </w:r>
+      <w:r>
+        <w:t xml:space="preserve">(2), 138–161.</w:t>
+      </w:r>
+    </w:p>
+    <w:bookmarkEnd w:id="65"/>
+    <w:bookmarkStart w:id="66" w:name="ref-WangRousey2026"/>
     <w:p>
       <w:pPr>
         <w:pStyle w:val="Bibliography"/>
       </w:pPr>
       <w:r>
-        <w:t xml:space="preserve">Franchak, J. M., Rousey, H. N., &amp; Wang, H. (2026). Natural statistics of infants’ everyday motor experiences relate to sitting and walking development.</w:t>
-      </w:r>
-      <w:r>
-        <w:t xml:space="preserve"> </w:t>
-      </w:r>
-      <w:r>
-        <w:rPr>
-          <w:i/>
-          <w:iCs/>
-        </w:rPr>
-        <w:t xml:space="preserve">Developmental Psychology</w:t>
+        <w:t xml:space="preserve">Wang, H., Rousey, H. N., &amp; Franchak, J. M. (2026).</w:t>
+      </w:r>
+      <w:r>
+        <w:t xml:space="preserve"> </w:t>
+      </w:r>
+      <w:r>
+        <w:rPr>
+          <w:i/>
+          <w:iCs/>
+        </w:rPr>
+        <w:t xml:space="preserve">Quantifying infants’ everyday restrained experiences in the home using wearable inertial sensors</w:t>
       </w:r>
       <w:r>
         <w:t xml:space="preserve">.</w:t>
       </w:r>
     </w:p>
-    <w:bookmarkEnd w:id="51"/>
-    <w:bookmarkStart w:id="52" w:name="ref-FranchakScott2021"/>
+    <w:bookmarkEnd w:id="66"/>
+    <w:bookmarkStart w:id="67" w:name="ref-YaoPlotz2019"/>
     <w:p>
       <w:pPr>
         <w:pStyle w:val="Bibliography"/>
       </w:pPr>
       <w:r>
-        <w:t xml:space="preserve">Franchak, J. M., Scott, V., &amp; Luo, C. (2021). A contactless method for measuring full-day, naturalistic motor behavior using wearable inertial sensors.</w:t>
-      </w:r>
-      <w:r>
-        <w:t xml:space="preserve"> </w:t>
-      </w:r>
-      <w:r>
-        <w:rPr>
-          <w:i/>
-          <w:iCs/>
-        </w:rPr>
-        <w:t xml:space="preserve">Frontiers in Psychology</w:t>
+        <w:t xml:space="preserve">Yao, X., Plötz, T., Johnson, M., &amp; Barbaro, K. D. E. (2019). Automated detection of infant holding using wearable sensing: Implications for developmental science and intervention.</w:t>
+      </w:r>
+      <w:r>
+        <w:t xml:space="preserve"> </w:t>
+      </w:r>
+      <w:r>
+        <w:rPr>
+          <w:i/>
+          <w:iCs/>
+        </w:rPr>
+        <w:t xml:space="preserve">Proceedings of the ACM on Interactive, Mobile, Wearable and Ubiquitous Technologies</w:t>
       </w:r>
       <w:r>
         <w:t xml:space="preserve">,</w:t>
@@ -1778,590 +2378,15 @@
           <w:i/>
           <w:iCs/>
         </w:rPr>
-        <w:t xml:space="preserve">12</w:t>
-      </w:r>
-      <w:r>
-        <w:t xml:space="preserve">, 701343.</w:t>
-      </w:r>
-    </w:p>
-    <w:bookmarkEnd w:id="52"/>
-    <w:bookmarkStart w:id="53" w:name="ref-FranchakTang2024"/>
-    <w:p>
-      <w:pPr>
-        <w:pStyle w:val="Bibliography"/>
-      </w:pPr>
-      <w:r>
-        <w:t xml:space="preserve">Franchak, J. M., Tang, M., Rousey, H., &amp; Luo, C. (2024). Long-form recording of infant body position in the home using wearable inertial sensors.</w:t>
-      </w:r>
-      <w:r>
-        <w:t xml:space="preserve"> </w:t>
-      </w:r>
-      <w:r>
-        <w:rPr>
-          <w:i/>
-          <w:iCs/>
-        </w:rPr>
-        <w:t xml:space="preserve">Behavior Research Methods</w:t>
-      </w:r>
-      <w:r>
-        <w:t xml:space="preserve">,</w:t>
-      </w:r>
-      <w:r>
-        <w:t xml:space="preserve"> </w:t>
-      </w:r>
-      <w:r>
-        <w:rPr>
-          <w:i/>
-          <w:iCs/>
-        </w:rPr>
-        <w:t xml:space="preserve">56</w:t>
-      </w:r>
-      <w:r>
-        <w:t xml:space="preserve">(5), 4982–5001.</w:t>
-      </w:r>
-    </w:p>
-    <w:bookmarkEnd w:id="53"/>
-    <w:bookmarkStart w:id="54" w:name="ref-GreenspanCunha2021"/>
-    <w:p>
-      <w:pPr>
-        <w:pStyle w:val="Bibliography"/>
-      </w:pPr>
-      <w:r>
-        <w:t xml:space="preserve">Greenspan, B., Cunha, A. B., &amp; Lobo, M. A. (2021). Design and validation of a smart garment to measure positioning practices of parents with young infants.</w:t>
-      </w:r>
-      <w:r>
-        <w:t xml:space="preserve"> </w:t>
-      </w:r>
-      <w:r>
-        <w:rPr>
-          <w:i/>
-          <w:iCs/>
-        </w:rPr>
-        <w:t xml:space="preserve">Infant Behavior &amp; Development</w:t>
-      </w:r>
-      <w:r>
-        <w:t xml:space="preserve">,</w:t>
-      </w:r>
-      <w:r>
-        <w:t xml:space="preserve"> </w:t>
-      </w:r>
-      <w:r>
-        <w:rPr>
-          <w:i/>
-          <w:iCs/>
-        </w:rPr>
-        <w:t xml:space="preserve">62</w:t>
-      </w:r>
-      <w:r>
-        <w:t xml:space="preserve">, 101530.</w:t>
-      </w:r>
-    </w:p>
-    <w:bookmarkEnd w:id="54"/>
-    <w:bookmarkStart w:id="55" w:name="ref-HerzbergFletcher2021"/>
-    <w:p>
-      <w:pPr>
-        <w:pStyle w:val="Bibliography"/>
-      </w:pPr>
-      <w:r>
-        <w:t xml:space="preserve">Herzberg, O., Fletcher, K. K., Schatz, J. L., Adolph, K. E., &amp; Tamis-LeMonda, C. S. (2021). Infant exuberant object play at home: Immense amounts of time-distributed, variable practice.</w:t>
-      </w:r>
-      <w:r>
-        <w:t xml:space="preserve"> </w:t>
-      </w:r>
-      <w:r>
-        <w:rPr>
-          <w:i/>
-          <w:iCs/>
-        </w:rPr>
-        <w:t xml:space="preserve">Child Development</w:t>
-      </w:r>
-      <w:r>
-        <w:t xml:space="preserve">.</w:t>
-      </w:r>
-    </w:p>
-    <w:bookmarkEnd w:id="55"/>
-    <w:bookmarkStart w:id="56" w:name="ref-KarasikKuchirko2022"/>
-    <w:p>
-      <w:pPr>
-        <w:pStyle w:val="Bibliography"/>
-      </w:pPr>
-      <w:r>
-        <w:t xml:space="preserve">Karasik, L. B., Kuchirko, Y. A., Dodojonova, R., &amp; Elison, J. T. (2022). Comparison of</w:t>
-      </w:r>
-      <w:r>
-        <w:t xml:space="preserve"> </w:t>
-      </w:r>
-      <w:r>
-        <w:t xml:space="preserve">U</w:t>
-      </w:r>
-      <w:r>
-        <w:t xml:space="preserve">.</w:t>
-      </w:r>
-      <w:r>
-        <w:t xml:space="preserve">S</w:t>
-      </w:r>
-      <w:r>
-        <w:t xml:space="preserve">. And tajik infants’ time in containment devices.</w:t>
-      </w:r>
-      <w:r>
-        <w:t xml:space="preserve"> </w:t>
-      </w:r>
-      <w:r>
-        <w:rPr>
-          <w:i/>
-          <w:iCs/>
-        </w:rPr>
-        <w:t xml:space="preserve">Infant and Child Development</w:t>
-      </w:r>
-      <w:r>
-        <w:t xml:space="preserve">,</w:t>
-      </w:r>
-      <w:r>
-        <w:t xml:space="preserve"> </w:t>
-      </w:r>
-      <w:r>
-        <w:rPr>
-          <w:i/>
-          <w:iCs/>
-        </w:rPr>
-        <w:t xml:space="preserve">31</w:t>
-      </w:r>
-      <w:r>
-        <w:t xml:space="preserve">(4).</w:t>
-      </w:r>
-    </w:p>
-    <w:bookmarkEnd w:id="56"/>
-    <w:bookmarkStart w:id="57" w:name="ref-KaurKumar2026"/>
-    <w:p>
-      <w:pPr>
-        <w:pStyle w:val="Bibliography"/>
-      </w:pPr>
-      <w:r>
-        <w:t xml:space="preserve">Kaur, I., Kumar, Y., &amp; Modi, N. (2026). Machine learning and mobile sensing for naturalistic infant behavior (0-36 months): A comprehensive review and research agenda.</w:t>
-      </w:r>
-      <w:r>
-        <w:t xml:space="preserve"> </w:t>
-      </w:r>
-      <w:r>
-        <w:rPr>
-          <w:i/>
-          <w:iCs/>
-        </w:rPr>
-        <w:t xml:space="preserve">Infant Behavior &amp; Development</w:t>
-      </w:r>
-      <w:r>
-        <w:t xml:space="preserve">,</w:t>
-      </w:r>
-      <w:r>
-        <w:t xml:space="preserve"> </w:t>
-      </w:r>
-      <w:r>
-        <w:rPr>
-          <w:i/>
-          <w:iCs/>
-        </w:rPr>
-        <w:t xml:space="preserve">84</w:t>
-      </w:r>
-      <w:r>
-        <w:t xml:space="preserve">(102217), 102217.</w:t>
-      </w:r>
-    </w:p>
-    <w:bookmarkEnd w:id="57"/>
-    <w:bookmarkStart w:id="58" w:name="ref-KretchAdolph2015"/>
-    <w:p>
-      <w:pPr>
-        <w:pStyle w:val="Bibliography"/>
-      </w:pPr>
-      <w:r>
-        <w:t xml:space="preserve">Kretch, K. S., &amp; Adolph, K. E. (2015). Active vision in passive locomotion: Real-world free viewing in infants and adults.</w:t>
-      </w:r>
-      <w:r>
-        <w:t xml:space="preserve"> </w:t>
-      </w:r>
-      <w:r>
-        <w:rPr>
-          <w:i/>
-          <w:iCs/>
-        </w:rPr>
-        <w:t xml:space="preserve">Developmental Science</w:t>
-      </w:r>
-      <w:r>
-        <w:t xml:space="preserve">,</w:t>
-      </w:r>
-      <w:r>
-        <w:t xml:space="preserve"> </w:t>
-      </w:r>
-      <w:r>
-        <w:rPr>
-          <w:i/>
-          <w:iCs/>
-        </w:rPr>
-        <w:t xml:space="preserve">18</w:t>
-      </w:r>
-      <w:r>
-        <w:t xml:space="preserve">(5), 736–750.</w:t>
-      </w:r>
-    </w:p>
-    <w:bookmarkEnd w:id="58"/>
-    <w:bookmarkStart w:id="59" w:name="ref-KretchEnriques2026"/>
-    <w:p>
-      <w:pPr>
-        <w:pStyle w:val="Bibliography"/>
-      </w:pPr>
-      <w:r>
-        <w:t xml:space="preserve">Kretch, K. S., Enriques, F. A., Franchak, J. M., Abney, D. H., Bell, C. A., Jerry, C. M., Lindig, K., &amp; Steffen, G. (2026). Body position classification using wearable sensors in infants with cerebral palsy.</w:t>
-      </w:r>
-      <w:r>
-        <w:t xml:space="preserve"> </w:t>
-      </w:r>
-      <w:r>
-        <w:rPr>
-          <w:i/>
-          <w:iCs/>
-        </w:rPr>
-        <w:t xml:space="preserve">Infant Behavior &amp; Development</w:t>
-      </w:r>
-      <w:r>
-        <w:t xml:space="preserve">,</w:t>
-      </w:r>
-      <w:r>
-        <w:t xml:space="preserve"> </w:t>
-      </w:r>
-      <w:r>
-        <w:rPr>
-          <w:i/>
-          <w:iCs/>
-        </w:rPr>
-        <w:t xml:space="preserve">84</w:t>
-      </w:r>
-      <w:r>
-        <w:t xml:space="preserve">(102215), 102215.</w:t>
-      </w:r>
-    </w:p>
-    <w:bookmarkEnd w:id="59"/>
-    <w:bookmarkStart w:id="60" w:name="ref-KretchFranchak2014"/>
-    <w:p>
-      <w:pPr>
-        <w:pStyle w:val="Bibliography"/>
-      </w:pPr>
-      <w:r>
-        <w:t xml:space="preserve">Kretch, K. S., Franchak, J. M., &amp; Adolph, K. E. (2014). Crawling and walking infants see the world differently.</w:t>
-      </w:r>
-      <w:r>
-        <w:t xml:space="preserve"> </w:t>
-      </w:r>
-      <w:r>
-        <w:rPr>
-          <w:i/>
-          <w:iCs/>
-        </w:rPr>
-        <w:t xml:space="preserve">Child Development</w:t>
-      </w:r>
-      <w:r>
-        <w:t xml:space="preserve">,</w:t>
-      </w:r>
-      <w:r>
-        <w:t xml:space="preserve"> </w:t>
-      </w:r>
-      <w:r>
-        <w:rPr>
-          <w:i/>
-          <w:iCs/>
-        </w:rPr>
-        <w:t xml:space="preserve">85</w:t>
-      </w:r>
-      <w:r>
-        <w:t xml:space="preserve">(4), 1503–1518.</w:t>
-      </w:r>
-    </w:p>
-    <w:bookmarkEnd w:id="60"/>
-    <w:bookmarkStart w:id="61" w:name="ref-KretchLuna2025"/>
-    <w:p>
-      <w:pPr>
-        <w:pStyle w:val="Bibliography"/>
-      </w:pPr>
-      <w:r>
-        <w:t xml:space="preserve">Kretch, K. S., Luna, A., Fausey, C. M., &amp; Franchak, J. M. (2025). Infant sitting status, sitting age, and everyday positioning experience across the transition to independent sitting.</w:t>
-      </w:r>
-      <w:r>
-        <w:t xml:space="preserve"> </w:t>
-      </w:r>
-      <w:r>
-        <w:rPr>
-          <w:i/>
-          <w:iCs/>
-        </w:rPr>
-        <w:t xml:space="preserve">Infancy</w:t>
-      </w:r>
-      <w:r>
-        <w:t xml:space="preserve">,</w:t>
-      </w:r>
-      <w:r>
-        <w:t xml:space="preserve"> </w:t>
-      </w:r>
-      <w:r>
-        <w:rPr>
-          <w:i/>
-          <w:iCs/>
-        </w:rPr>
-        <w:t xml:space="preserve">30</w:t>
-      </w:r>
-      <w:r>
-        <w:t xml:space="preserve">, e70059.</w:t>
-      </w:r>
-    </w:p>
-    <w:bookmarkEnd w:id="61"/>
-    <w:bookmarkStart w:id="62" w:name="ref-KretchMarcinowski2022"/>
-    <w:p>
-      <w:pPr>
-        <w:pStyle w:val="Bibliography"/>
-      </w:pPr>
-      <w:r>
-        <w:t xml:space="preserve">Kretch, K. S., Marcinowski, E. C., Hsu, L.-Y., Koziol, N. A., Harbourne, R. T., Lobo, M. A., &amp; Dusing, S. C. (2022). Opportunities for learning and social interaction in infant sitting: Effects of sitting support, sitting skill, and gross motor delay.</w:t>
-      </w:r>
-      <w:r>
-        <w:t xml:space="preserve"> </w:t>
-      </w:r>
-      <w:r>
-        <w:rPr>
-          <w:i/>
-          <w:iCs/>
-        </w:rPr>
-        <w:t xml:space="preserve">Developmental Science</w:t>
-      </w:r>
-      <w:r>
-        <w:t xml:space="preserve">, e13318.</w:t>
-      </w:r>
-    </w:p>
-    <w:bookmarkEnd w:id="62"/>
-    <w:bookmarkStart w:id="63" w:name="ref-LuoFranchak2020"/>
-    <w:p>
-      <w:pPr>
-        <w:pStyle w:val="Bibliography"/>
-      </w:pPr>
-      <w:r>
-        <w:t xml:space="preserve">Luo, C., &amp; Franchak, J. M. (2020). Head and body structure infants’ visual experiences during mobile, naturalistic play.</w:t>
-      </w:r>
-      <w:r>
-        <w:t xml:space="preserve"> </w:t>
-      </w:r>
-      <w:r>
-        <w:rPr>
-          <w:i/>
-          <w:iCs/>
-        </w:rPr>
-        <w:t xml:space="preserve">PloS One</w:t>
-      </w:r>
-      <w:r>
-        <w:t xml:space="preserve">,</w:t>
-      </w:r>
-      <w:r>
-        <w:t xml:space="preserve"> </w:t>
-      </w:r>
-      <w:r>
-        <w:rPr>
-          <w:i/>
-          <w:iCs/>
-        </w:rPr>
-        <w:t xml:space="preserve">15</w:t>
-      </w:r>
-      <w:r>
-        <w:t xml:space="preserve">(11), e0242009.</w:t>
-      </w:r>
-    </w:p>
-    <w:bookmarkEnd w:id="63"/>
-    <w:bookmarkStart w:id="64" w:name="ref-MalachowskiSalo2023"/>
-    <w:p>
-      <w:pPr>
-        <w:pStyle w:val="Bibliography"/>
-      </w:pPr>
-      <w:r>
-        <w:t xml:space="preserve">Malachowski, L. G., Salo, V. C., Needham, A. W., &amp; Humphreys, K. L. (2023). Infant placement and language exposure in daily life.</w:t>
-      </w:r>
-      <w:r>
-        <w:t xml:space="preserve"> </w:t>
-      </w:r>
-      <w:r>
-        <w:rPr>
-          <w:i/>
-          <w:iCs/>
-        </w:rPr>
-        <w:t xml:space="preserve">Infant and Child Development</w:t>
-      </w:r>
-      <w:r>
-        <w:t xml:space="preserve">.</w:t>
-      </w:r>
-    </w:p>
-    <w:bookmarkEnd w:id="64"/>
-    <w:bookmarkStart w:id="65" w:name="ref-McElwainFisher2024"/>
-    <w:p>
-      <w:pPr>
-        <w:pStyle w:val="Bibliography"/>
-      </w:pPr>
-      <w:r>
-        <w:t xml:space="preserve">McElwain, N. L., Fisher, M. C., Nebeker, C., Bodway, J. M., Islam, B., &amp; Hasegawa-Johnson, M. (2024). Evaluating users’ experiences of a child multimodal wearable device: Mixed methods approach.</w:t>
-      </w:r>
-      <w:r>
-        <w:t xml:space="preserve"> </w:t>
-      </w:r>
-      <w:r>
-        <w:rPr>
-          <w:i/>
-          <w:iCs/>
-        </w:rPr>
-        <w:t xml:space="preserve">JMIR Human Factors</w:t>
-      </w:r>
-      <w:r>
-        <w:t xml:space="preserve">,</w:t>
-      </w:r>
-      <w:r>
-        <w:t xml:space="preserve"> </w:t>
-      </w:r>
-      <w:r>
-        <w:rPr>
-          <w:i/>
-          <w:iCs/>
-        </w:rPr>
-        <w:t xml:space="preserve">11</w:t>
-      </w:r>
-      <w:r>
-        <w:t xml:space="preserve">(1), e49316.</w:t>
-      </w:r>
-    </w:p>
-    <w:bookmarkEnd w:id="65"/>
-    <w:bookmarkStart w:id="66" w:name="ref-RouseyTang2026"/>
-    <w:p>
-      <w:pPr>
-        <w:pStyle w:val="Bibliography"/>
-      </w:pPr>
-      <w:r>
-        <w:t xml:space="preserve">Rousey, H. N., Tang, M., Garcia, S., &amp; Franchak, J. M. (2026). Within-day variations in infant body position predict caregiver speech input.</w:t>
-      </w:r>
-      <w:r>
-        <w:t xml:space="preserve"> </w:t>
-      </w:r>
-      <w:r>
-        <w:rPr>
-          <w:i/>
-          <w:iCs/>
-        </w:rPr>
-        <w:t xml:space="preserve">Developmental Science</w:t>
-      </w:r>
-      <w:r>
-        <w:t xml:space="preserve">,</w:t>
-      </w:r>
-      <w:r>
-        <w:t xml:space="preserve"> </w:t>
-      </w:r>
-      <w:r>
-        <w:rPr>
-          <w:i/>
-          <w:iCs/>
-        </w:rPr>
-        <w:t xml:space="preserve">29</w:t>
-      </w:r>
-      <w:r>
-        <w:t xml:space="preserve">(2), e70120.</w:t>
-      </w:r>
-    </w:p>
-    <w:bookmarkEnd w:id="66"/>
-    <w:bookmarkStart w:id="67" w:name="ref-SoskaAdolph2014"/>
-    <w:p>
-      <w:pPr>
-        <w:pStyle w:val="Bibliography"/>
-      </w:pPr>
-      <w:r>
-        <w:t xml:space="preserve">Soska, K. C., &amp; Adolph, K. E. (2014). Postural position constrains multimodal object exploration in infants.</w:t>
-      </w:r>
-      <w:r>
-        <w:t xml:space="preserve"> </w:t>
-      </w:r>
-      <w:r>
-        <w:rPr>
-          <w:i/>
-          <w:iCs/>
-        </w:rPr>
-        <w:t xml:space="preserve">Infancy</w:t>
-      </w:r>
-      <w:r>
-        <w:t xml:space="preserve">,</w:t>
-      </w:r>
-      <w:r>
-        <w:t xml:space="preserve"> </w:t>
-      </w:r>
-      <w:r>
-        <w:rPr>
-          <w:i/>
-          <w:iCs/>
-        </w:rPr>
-        <w:t xml:space="preserve">19</w:t>
-      </w:r>
-      <w:r>
-        <w:t xml:space="preserve">(2), 138–161.</w:t>
+        <w:t xml:space="preserve">3</w:t>
+      </w:r>
+      <w:r>
+        <w:t xml:space="preserve">(2).</w:t>
       </w:r>
     </w:p>
     <w:bookmarkEnd w:id="67"/>
-    <w:bookmarkStart w:id="68" w:name="ref-WangRousey2026"/>
-    <w:p>
-      <w:pPr>
-        <w:pStyle w:val="Bibliography"/>
-      </w:pPr>
-      <w:r>
-        <w:t xml:space="preserve">Wang, H., Rousey, H. N., &amp; Franchak, J. M. (2026).</w:t>
-      </w:r>
-      <w:r>
-        <w:t xml:space="preserve"> </w:t>
-      </w:r>
-      <w:r>
-        <w:rPr>
-          <w:i/>
-          <w:iCs/>
-        </w:rPr>
-        <w:t xml:space="preserve">Quantifying infants’ everyday restrained experiences in the home using wearable inertial sensors</w:t>
-      </w:r>
-      <w:r>
-        <w:t xml:space="preserve">.</w:t>
-      </w:r>
-    </w:p>
     <w:bookmarkEnd w:id="68"/>
-    <w:bookmarkStart w:id="69" w:name="ref-YaoPlotz2019"/>
-    <w:p>
-      <w:pPr>
-        <w:pStyle w:val="Bibliography"/>
-      </w:pPr>
-      <w:r>
-        <w:t xml:space="preserve">Yao, X., Plötz, T., Johnson, M., &amp; Barbaro, K. D. E. (2019). Automated detection of infant holding using wearable sensing: Implications for developmental science and intervention.</w:t>
-      </w:r>
-      <w:r>
-        <w:t xml:space="preserve"> </w:t>
-      </w:r>
-      <w:r>
-        <w:rPr>
-          <w:i/>
-          <w:iCs/>
-        </w:rPr>
-        <w:t xml:space="preserve">Proceedings of the ACM on Interactive, Mobile, Wearable and Ubiquitous Technologies</w:t>
-      </w:r>
-      <w:r>
-        <w:t xml:space="preserve">,</w:t>
-      </w:r>
-      <w:r>
-        <w:t xml:space="preserve"> </w:t>
-      </w:r>
-      <w:r>
-        <w:rPr>
-          <w:i/>
-          <w:iCs/>
-        </w:rPr>
-        <w:t xml:space="preserve">3</w:t>
-      </w:r>
-      <w:r>
-        <w:t xml:space="preserve">(2).</w:t>
-      </w:r>
-    </w:p>
-    <w:bookmarkEnd w:id="69"/>
-    <w:bookmarkEnd w:id="70"/>
-    <w:bookmarkStart w:id="74" w:name="fig-timelines"/>
+    <w:bookmarkStart w:id="72" w:name="fig-timeline"/>
     <w:p>
       <w:pPr>
         <w:pStyle w:val="FigureTitle"/>
@@ -2375,7 +2400,7 @@
         <w:pStyle w:val="Caption"/>
       </w:pPr>
       <w:r>
-        <w:t xml:space="preserve">Full-day predictions of position and restraint time by age</w:t>
+        <w:t xml:space="preserve">Full-day timelines for two infants</w:t>
       </w:r>
     </w:p>
     <w:p>
@@ -2385,20 +2410,105 @@
       <w:r>
         <w:drawing>
           <wp:inline>
-            <wp:extent cx="5943600" cy="4358640"/>
+            <wp:extent cx="5943600" cy="7269398"/>
             <wp:effectExtent b="0" l="0" r="0" t="0"/>
-            <wp:docPr descr="" title="" id="72" name="Picture"/>
+            <wp:docPr descr="" title="" id="70" name="Picture"/>
             <a:graphic>
               <a:graphicData uri="http://schemas.openxmlformats.org/drawingml/2006/picture">
                 <pic:pic>
                   <pic:nvPicPr>
-                    <pic:cNvPr descr="age_figure.png" id="73" name="Picture"/>
+                    <pic:cNvPr descr="timelines.png" id="71" name="Picture"/>
                     <pic:cNvPicPr>
                       <a:picLocks noChangeArrowheads="1" noChangeAspect="1"/>
                     </pic:cNvPicPr>
                   </pic:nvPicPr>
                   <pic:blipFill>
-                    <a:blip r:embed="rId71"/>
+                    <a:blip r:embed="rId69"/>
+                    <a:stretch>
+                      <a:fillRect/>
+                    </a:stretch>
+                  </pic:blipFill>
+                  <pic:spPr bwMode="auto">
+                    <a:xfrm>
+                      <a:off x="0" y="0"/>
+                      <a:ext cx="5943600" cy="7269398"/>
+                    </a:xfrm>
+                    <a:prstGeom prst="rect">
+                      <a:avLst/>
+                    </a:prstGeom>
+                    <a:noFill/>
+                    <a:ln w="9525">
+                      <a:noFill/>
+                      <a:headEnd/>
+                      <a:tailEnd/>
+                    </a:ln>
+                  </pic:spPr>
+                </pic:pic>
+              </a:graphicData>
+            </a:graphic>
+          </wp:inline>
+        </w:drawing>
+      </w:r>
+    </w:p>
+    <w:bookmarkEnd w:id="72"/>
+    <w:p>
+      <w:pPr>
+        <w:pStyle w:val="FigureNote"/>
+      </w:pPr>
+      <w:r>
+        <w:rPr>
+          <w:i/>
+          <w:iCs/>
+        </w:rPr>
+        <w:t xml:space="preserve">Note</w:t>
+      </w:r>
+      <w:r>
+        <w:t xml:space="preserve">. Full-day timelines of position and restraint for exemplar (A) 9-month-old and (B) 11-month-old infants. Each black rectangle indicates the machine learning model prediction of restrained (top row) and unrestrained (bottom row) positions. Vertical lines mark the start and end times of each recording and gray rectangles signify nap times when data were excluded.</w:t>
+      </w:r>
+    </w:p>
+    <w:p>
+      <w:r>
+        <w:br w:type="page"/>
+      </w:r>
+    </w:p>
+    <w:bookmarkStart w:id="76" w:name="fig-age"/>
+    <w:p>
+      <w:pPr>
+        <w:pStyle w:val="FigureTitle"/>
+      </w:pPr>
+      <w:r>
+        <w:t xml:space="preserve">Figure 2</w:t>
+      </w:r>
+    </w:p>
+    <w:p>
+      <w:pPr>
+        <w:pStyle w:val="Caption"/>
+      </w:pPr>
+      <w:r>
+        <w:t xml:space="preserve">Full-day predictions of position and restraint time by age</w:t>
+      </w:r>
+    </w:p>
+    <w:p>
+      <w:pPr>
+        <w:pStyle w:val="FigureWithNote"/>
+      </w:pPr>
+      <w:r>
+        <w:drawing>
+          <wp:inline>
+            <wp:extent cx="5943600" cy="4358640"/>
+            <wp:effectExtent b="0" l="0" r="0" t="0"/>
+            <wp:docPr descr="" title="" id="74" name="Picture"/>
+            <a:graphic>
+              <a:graphicData uri="http://schemas.openxmlformats.org/drawingml/2006/picture">
+                <pic:pic>
+                  <pic:nvPicPr>
+                    <pic:cNvPr descr="age_figure.png" id="75" name="Picture"/>
+                    <pic:cNvPicPr>
+                      <a:picLocks noChangeArrowheads="1" noChangeAspect="1"/>
+                    </pic:cNvPicPr>
+                  </pic:nvPicPr>
+                  <pic:blipFill>
+                    <a:blip r:embed="rId73"/>
                     <a:stretch>
                       <a:fillRect/>
                     </a:stretch>
@@ -2425,7 +2535,7 @@
         </w:drawing>
       </w:r>
     </w:p>
-    <w:bookmarkEnd w:id="74"/>
+    <w:bookmarkEnd w:id="76"/>
     <w:p>
       <w:pPr>
         <w:pStyle w:val="FigureNote"/>
@@ -2446,7 +2556,7 @@
         <w:br w:type="page"/>
       </w:r>
     </w:p>
-    <w:bookmarkEnd w:id="75"/>
+    <w:bookmarkEnd w:id="77"/>
     <w:sectPr>
       <w:headerReference r:id="rId8" w:type="even"/>
       <w:headerReference r:id="rId9" w:type="default"/>

</xml_diff>